<commit_message>
Polish Field Diary translations and clarify consent and AI limits
</commit_message>
<xml_diff>
--- a/practice-guides/diario-de-campo.docx
+++ b/practice-guides/diario-de-campo.docx
@@ -41,7 +41,7 @@
         </w:drawing>
       </w:r>
       <w:r>
-        <w:t xml:space="preserve">Diario de Campo</w:t>
+        <w:t xml:space="preserve">Diario de campo</w:t>
       </w:r>
     </w:p>
     <w:p>
@@ -66,7 +66,7 @@
         <w:rPr>
           <w:sz w:val="21"/>
         </w:rPr>
-        <w:t xml:space="preserve">Edición en español de México v1.0 · 24 de octubre de 2026</w:t>
+        <w:t xml:space="preserve">Edición en español de México v1.0.1 · 24 de octubre de 2026</w:t>
       </w:r>
       <w:r>
         <w:rPr>
@@ -101,7 +101,7 @@
         <w:rPr>
           <w:sz w:val="21"/>
         </w:rPr>
-        <w:t xml:space="preserve">Diario de Campo es una guía práctica abierta, publicada por Spiralweb Stewardship Association en Spiralweb Papers. Parte del trabajo de las personas en un lugar vivo: algo se observa, se registra y se investiga en conjunto. Una acción se vuelve posible y la experiencia modifica el siguiente paso. La guía relaciona este movimiento con conocimientos pertinentes, el diálogo crítico con la IA y recursos que pueden sostener la vida del lugar y la continuidad del trabajo.</w:t>
+        <w:t xml:space="preserve">Diario de campo es una guía práctica abierta, publicada por Spiralweb Stewardship Association en Spiralweb Papers. Parte del trabajo de las personas en un lugar vivo: algo se observa, se registra y se investiga en conjunto. Una acción se vuelve posible y la experiencia modifica el siguiente paso. La guía relaciona este movimiento con conocimientos útiles para investigar, el diálogo crítico con la IA y recursos que pueden sostener la vida del lugar y la continuidad del trabajo.</w:t>
       </w:r>
     </w:p>
     <w:p>
@@ -200,7 +200,7 @@
         <w:rPr>
           <w:sz w:val="21"/>
         </w:rPr>
-        <w:t xml:space="preserve">La guía reúne una aplicación práctica de </w:t>
+        <w:t xml:space="preserve">La guía propone una aplicación práctica de </w:t>
       </w:r>
       <w:hyperlink r:id="rId15">
         <w:r>
@@ -587,7 +587,7 @@
         <w:rPr>
           <w:sz w:val="21"/>
         </w:rPr>
-        <w:t xml:space="preserve">En una reunión presentan las contribuciones que eligieron. El grupo compara las experiencias y decide investigar la cobertura del suelo. Explica su elección y guarda otras preguntas para después. La IA puede ayudar a reformular las contribuciones y sugerir explicaciones pertinentes. Las personas las revisan y corrigen los saltos injustificados de la observación a la afirmación.</w:t>
+        <w:t xml:space="preserve">En una reunión presentan las contribuciones que eligieron. El grupo compara las experiencias y decide investigar la cobertura del suelo. Explica su elección y guarda otras preguntas para después. La IA puede ayudar a reformular las contribuciones y sugerir explicaciones posibles. Las personas las revisan y corrigen los saltos injustificados de la observación a la afirmación.</w:t>
       </w:r>
     </w:p>
     <w:p>
@@ -644,7 +644,7 @@
         <w:rPr>
           <w:sz w:val="21"/>
         </w:rPr>
-        <w:t xml:space="preserve">En la siguiente visita pertinente, las nuevas observaciones se comparan con el punto de partida. La IA ha sugerido que se utilizó menos agua, pero eso no se midió. El grupo corrige el texto y examina qué puede afirmar. Quizá el transporte exigió demasiado trabajo, o la diferencia se deba a otras condiciones. Se modifican el ensayo y la distribución del trabajo.</w:t>
+        <w:t xml:space="preserve">En la siguiente visita, las nuevas observaciones se comparan con el punto de partida. La IA ha sugerido que se utilizó menos agua, pero eso no se midió. El grupo corrige el texto y examina qué puede afirmar. Quizá el transporte exigió demasiado trabajo, o la diferencia se deba a otras condiciones. Se modifican el ensayo y la distribución del trabajo.</w:t>
       </w:r>
     </w:p>
     <w:p>
@@ -663,7 +663,7 @@
         <w:rPr>
           <w:sz w:val="21"/>
         </w:rPr>
-        <w:t xml:space="preserve">Ahora el grupo puede invitar a una persona asesora o a una escuela de campo para investigar una pregunta mejor definida. Un nuevo acuerdo puede facilitar materiales, aprendizaje o remuneración para el seguimiento necesario. Al volver a la investigación, el grupo examina qué se hizo realmente posible. La comprensión compartida tiene mejores fundamentos, aunque persistan desacuerdos e incertidumbres.</w:t>
+        <w:t xml:space="preserve">Ahora el grupo puede invitar a una persona asesora o a una escuela campesina para investigar una pregunta mejor definida. Un nuevo acuerdo puede facilitar materiales, aprendizaje o remuneración para el seguimiento necesario. Al volver a la investigación, el grupo examina qué se hizo realmente posible. La comprensión compartida tiene mejores fundamentos, aunque persistan desacuerdos e incertidumbres.</w:t>
       </w:r>
     </w:p>
     <w:p>
@@ -696,7 +696,7 @@
         <w:rPr>
           <w:sz w:val="21"/>
         </w:rPr>
-        <w:t xml:space="preserve">El diario y el ledger conservan distintas partes de una misma práctica. El diario da espacio para observar e investigar. El ledger relaciona material elegido con la memoria compartida necesaria para asumir responsabilidades y dar seguimiento. La espiral de aprendizaje es el movimiento a lo largo del tiempo; no es otro documento.</w:t>
+        <w:t xml:space="preserve">El diario y el registro (ledger) conservan distintas partes de una misma práctica. El diario da espacio para observar e investigar. El registro relaciona material elegido con la memoria compartida necesaria para asumir responsabilidades y dar seguimiento. La espiral de aprendizaje es el movimiento a lo largo del tiempo; no es otro documento.</w:t>
       </w:r>
     </w:p>
     <w:tbl>
@@ -957,7 +957,7 @@
                 <w:b w:val="0"/>
                 <w:sz w:val="18"/>
               </w:rPr>
-              <w:t xml:space="preserve">Conversación, comparación y contraste con conocimientos pertinentes sobre una pregunta elegida.</w:t>
+              <w:t xml:space="preserve">Conversación, comparación y contraste con conocimientos que ayuden a esclarecer una pregunta elegida.</w:t>
             </w:r>
           </w:p>
         </w:tc>
@@ -1279,7 +1279,7 @@
         <w:pStyle w:val="Heading2"/>
       </w:pPr>
       <w:r>
-        <w:t xml:space="preserve">Cuándo un material del diario se vuelve pertinente para el ledger</w:t>
+        <w:t xml:space="preserve">Cuándo un material del diario pasa al registro</w:t>
       </w:r>
     </w:p>
     <w:p>
@@ -1298,7 +1298,7 @@
         <w:pStyle w:val="Heading2"/>
       </w:pPr>
       <w:r>
-        <w:t xml:space="preserve">Qué hace del ledger una memoria viva</w:t>
+        <w:t xml:space="preserve">Qué hace del registro una memoria viva</w:t>
       </w:r>
     </w:p>
     <w:p>
@@ -1494,14 +1494,14 @@
             <w:u w:val="single"/>
             <w:sz w:val="21"/>
           </w:rPr>
-          <w:t xml:space="preserve">working wager</w:t>
+          <w:t xml:space="preserve">apuesta de trabajo</w:t>
         </w:r>
       </w:hyperlink>
       <w:r>
         <w:rPr>
           <w:sz w:val="21"/>
         </w:rPr>
-        <w:t xml:space="preserve">, o hipótesis de trabajo, expresa lo que espera el grupo y qué podría llevarlo a cambiar su comprensión. Relaciona la pregunta con la acción, el aprendizaje, los recursos y la valoración posterior. Por ejemplo: se espera que cierta cobertura del suelo conserve la humedad si el material es adecuado y el trabajo puede sostenerse. Examinen el estado de las plantas, otras explicaciones y la carga de trabajo real.</w:t>
+        <w:t xml:space="preserve"> (working wager) expresa lo que espera el grupo y qué podría llevarlo a cambiar su comprensión. Relaciona la pregunta con la acción, el aprendizaje, los recursos y la valoración posterior. Por ejemplo: se espera que cierta cobertura del suelo conserve la humedad si el material es adecuado y el trabajo puede sostenerse. Examinen el estado de las plantas, otras explicaciones y la carga de trabajo real.</w:t>
       </w:r>
     </w:p>
     <w:p>
@@ -1542,7 +1542,7 @@
         <w:rPr>
           <w:sz w:val="21"/>
         </w:rPr>
-        <w:t xml:space="preserve">Comienza con lo que la persona observa, hace o quiere mostrar. Añade fecha, lugar y origen al material que deba poder recuperarse. Una referencia puede ser B01: primera visita, [fecha], [lugar]; las fotos y el audio pueden identificarse como B01-foto y B01-audio. El grupo elige su propio sistema y protege los lugares y las identidades sensibles.</w:t>
+        <w:t xml:space="preserve">Comiencen con lo que la persona observa, hace o quiere mostrar. Añadan fecha, lugar y origen al material que deba poder recuperarse. Una referencia puede ser B01: primera visita, [fecha], [lugar]; las fotos y el audio pueden identificarse como B01-foto y B01-audio. El grupo elige su propio sistema y protege los lugares y las identidades sensibles.</w:t>
       </w:r>
     </w:p>
     <w:p>
@@ -1632,7 +1632,7 @@
         <w:rPr>
           <w:sz w:val="21"/>
         </w:rPr>
-        <w:t xml:space="preserve">En Learning with Living Places, la observación, el trabajo de diario y la interpretación compartida acordados forman parte del tiempo remunerado de aprendizaje y trabajo. Las contribuciones adicionales son voluntarias. Otros grupos acuerdan una carga realista. La documentación debe apoyar el trabajo y simplificarse cuando lo sobrecarga.</w:t>
+        <w:t xml:space="preserve">En Learning with Living Places, la observación, el trabajo de diario y la interpretación compartida acordados forman parte del tiempo remunerado de aprendizaje y trabajo. Las contribuciones adicionales son voluntarias. Otros grupos acuerdan una carga realista. La documentación debe apoyar el trabajo y simplificarse cuando se vuelve una carga.</w:t>
       </w:r>
     </w:p>
     <w:p>
@@ -1985,7 +1985,7 @@
                 <w:b w:val="0"/>
                 <w:sz w:val="18"/>
               </w:rPr>
-              <w:t xml:space="preserve">No hay elementos suficientes para valorar la situación. Esto no significa amarillo.</w:t>
+              <w:t xml:space="preserve">No hay elementos suficientes para valorar la situación. No equivale a amarillo.</w:t>
             </w:r>
           </w:p>
         </w:tc>
@@ -2023,7 +2023,7 @@
         <w:rPr>
           <w:sz w:val="21"/>
         </w:rPr>
-        <w:t xml:space="preserve">Desconocido: la pregunta es pertinente, pero todavía no sabemos lo suficiente. No pertinente: la pregunta no corresponde a esta investigación. Omitido deliberadamente: algo no se registra o no se incluye en este material. Esto no dice nada sobre la condición de que se trate. Un campo vacío no tiene un significado único; ni las personas ni la IA pueden adivinarlo.</w:t>
+        <w:t xml:space="preserve">Desconocido: la pregunta es pertinente, pero todavía no sabemos lo suficiente. No pertinente: la pregunta no corresponde a esta investigación. Omitido deliberadamente: algo no se registra o no se incluye en este material. Esto no dice nada sobre la condición de que se trate. Un campo vacío no tiene un significado único; ni las personas ni la IA deben adivinarlo.</w:t>
       </w:r>
     </w:p>
     <w:p>
@@ -2203,7 +2203,7 @@
         <w:rPr>
           <w:sz w:val="21"/>
         </w:rPr>
-        <w:t xml:space="preserve">Acuerden a quién contactar, qué quiere preguntar el grupo, qué material puede compartirse y quién traerá la respuesta de vuelta. La asesoría, los análisis de laboratorio, el diálogo institucional o el contacto con otras personas cultivadoras se examinan junto con las experiencias originales. Una respuesta externa orienta la siguiente acción solo después de una revisión local pertinente y un acuerdo. Esto es bottom-linking en la práctica.</w:t>
+        <w:t xml:space="preserve">Acuerden a quién contactar, qué quiere preguntar el grupo, qué material puede compartirse y quién traerá la respuesta de vuelta. La asesoría, los análisis de laboratorio, el diálogo institucional o el contacto con otras personas cultivadoras se examinan junto con las experiencias originales. Una respuesta externa orienta la siguiente acción solo después de una revisión local adecuada y un acuerdo. Esto es bottom-linking (articulación desde abajo) en la práctica.</w:t>
       </w:r>
     </w:p>
     <w:p>
@@ -2244,7 +2244,7 @@
         <w:rPr>
           <w:sz w:val="21"/>
         </w:rPr>
-        <w:t xml:space="preserve">De manera individual o en grupo, las personas asumimos el papel de amigos críticos de la IA: abiertos a lo que puede aportar y atentos a errores, sobreinterpretaciones y cambios de sentido. La IA puede apoyar la expresión, la traducción, el trabajo con fuentes y la comparación. Sus contribuciones se vuelven útiles para la investigación mediante la revisión humana y su puesta a prueba en la práctica.</w:t>
+        <w:t xml:space="preserve">De manera individual o en grupo, las personas asumimos el papel de amigos críticos de la IA: con apertura a lo que puede aportar y con atención a errores, sobreinterpretaciones y cambios de sentido. La IA puede apoyar la expresión, la traducción, el trabajo con fuentes y la comparación. Sus contribuciones se vuelven útiles para la investigación mediante la revisión humana y su puesta a prueba en la práctica.</w:t>
       </w:r>
     </w:p>
     <w:p>
@@ -2305,7 +2305,7 @@
         <w:rPr>
           <w:sz w:val="21"/>
         </w:rPr>
-        <w:t xml:space="preserve">La IA recibe primero una tarea delimitada y el material elegido para ese propósito. Con una foto o una grabación, revisa lo que la IA dice que aparece en ella antes de continuar. Las palabras, imágenes y traducciones poco claras deben seguir señaladas como tales. Si el apoyo lingüístico o técnico no es suficiente, recurre a una persona competente.</w:t>
+        <w:t xml:space="preserve">La IA recibe primero una tarea claramente definida y delimitada y el material elegido para ese propósito. Con una foto o una grabación, revisa lo que la IA dice que aparece en ella antes de continuar. Las palabras, imágenes y traducciones poco claras deben seguir señaladas como tales. Si la IA no maneja bien la lengua o el tipo de material, recurre a una persona competente.</w:t>
       </w:r>
     </w:p>
     <w:p>
@@ -2335,7 +2335,7 @@
         <w:rPr>
           <w:sz w:val="21"/>
         </w:rPr>
-        <w:t xml:space="preserve">Después pregunta: ¿qué afirmaciones provienen de mi material? ¿Qué añadió la IA? ¿Qué fuentes pueden verificarse? ¿Se conservaron la incertidumbre y los desacuerdos? ¿Qué requiere otra observación o el juicio de una persona especialista? La IA también puede omitir una posibilidad pertinente; su respuesta no establece los límites de la investigación.</w:t>
+        <w:t xml:space="preserve">Después pregunta: ¿qué afirmaciones provienen de mi material? ¿Qué añadió la IA? ¿Qué fuentes pueden verificarse? ¿Se conservaron la incertidumbre y los desacuerdos? ¿Qué requiere otra observación o el juicio de una persona especialista? La IA también puede omitir una posibilidad importante; su respuesta no establece los límites de la investigación.</w:t>
       </w:r>
     </w:p>
     <w:p>
@@ -2365,7 +2365,7 @@
         <w:rPr>
           <w:sz w:val="21"/>
         </w:rPr>
-        <w:t xml:space="preserve">Por ejemplo, «El suelo se sentía más fresco» se convierte en «Se redujo el consumo de agua» en el texto de la IA. La persona señala ese salto, corrige el texto y decide qué investigación hace falta. El original, la contribución de la IA y la corrección ofrecen una base concreta para evaluar la IA en una relación adecuada con las personas y el lugar.</w:t>
+        <w:t xml:space="preserve">Por ejemplo, «El suelo se sentía más fresco» se convierte en «Se redujo el consumo de agua» en el texto de la IA. La persona señala ese salto, corrige el texto y decide qué investigación hace falta. El original, la contribución de la IA y la corrección ofrecen una base concreta para evaluar la IA en justa relación.</w:t>
       </w:r>
     </w:p>
     <w:p>
@@ -3139,7 +3139,7 @@
         <w:rPr>
           <w:sz w:val="21"/>
         </w:rPr>
-        <w:t xml:space="preserve">Las tareas acordadas forman parte del tiempo remunerado de aprendizaje y trabajo del programa. No se espera una entrega diaria del diario personal. Una actividad logra su propósito cuando abre aprendizajes y acciones pertinentes; la cantidad de documentación no es un fin en sí mismo.</w:t>
+        <w:t xml:space="preserve">En Learning with Living Places, las tareas acordadas forman parte del tiempo remunerado de aprendizaje y trabajo. No se espera una entrega diaria del diario personal. Una actividad logra su propósito cuando abre aprendizajes y acciones útiles; la cantidad de documentación no es un fin en sí mismo.</w:t>
       </w:r>
     </w:p>
     <w:p>
@@ -3199,7 +3199,7 @@
         <w:rPr>
           <w:sz w:val="21"/>
         </w:rPr>
-        <w:t xml:space="preserve">En una finca se preparan dos parcelas para distintos ensayos de cultivo. El equipo describe sus condiciones iniciales mediante observaciones propias e investigaciones especializadas pertinentes. Elige una pregunta, quizá sobre cobertura del suelo y agua, acuerda un ensayo pequeño y también documenta materiales y tiempo de trabajo. Se involucra a una escuela de campo o una persona asesora cuando eso puede ayudar a investigar. En la siguiente visita pertinente, el equipo revisa el proceso y el siguiente paso.</w:t>
+        <w:t xml:space="preserve">En un terreno de cultivo se preparan dos parcelas para distintos ensayos de cultivo. El equipo describe sus condiciones iniciales mediante observaciones propias e investigaciones especializadas sobre esas condiciones. Elige una pregunta, quizá sobre cobertura del suelo y agua, acuerda un ensayo pequeño y también documenta materiales y tiempo de trabajo. Se involucra a una escuela campesina o una persona asesora cuando eso puede ayudar a investigar. En la siguiente visita, el equipo revisa el proceso y el siguiente paso.</w:t>
       </w:r>
     </w:p>
     <w:tbl>
@@ -3368,7 +3368,7 @@
                 <w:b w:val="0"/>
                 <w:sz w:val="18"/>
               </w:rPr>
-              <w:t xml:space="preserve">Los program stewards, responsables del acompañamiento del programa, prueban el método y aclaran lenguas, acceso, funciones y seguridad.</w:t>
+              <w:t xml:space="preserve">Las personas responsables del acompañamiento (programme stewards) prueban el método y aclaran lenguas, acceso, funciones y seguridad.</w:t>
             </w:r>
           </w:p>
         </w:tc>
@@ -3644,7 +3644,7 @@
                 <w:b w:val="0"/>
                 <w:sz w:val="18"/>
               </w:rPr>
-              <w:t xml:space="preserve">El material elegido se pone en diálogo con otras personas pertinentes.</w:t>
+              <w:t xml:space="preserve">El material elegido se pone en diálogo con personas que puedan contribuir a la investigación.</w:t>
             </w:r>
           </w:p>
         </w:tc>
@@ -3736,7 +3736,7 @@
                 <w:b w:val="0"/>
                 <w:sz w:val="18"/>
               </w:rPr>
-              <w:t xml:space="preserve">Se revisan aprendizajes, equipo, recursos y responsabilidades.</w:t>
+              <w:t xml:space="preserve">Se revisan los aprendizajes, las herramientas y el equipamiento, los recursos y las responsabilidades.</w:t>
             </w:r>
           </w:p>
         </w:tc>
@@ -3793,7 +3793,7 @@
         <w:rPr>
           <w:sz w:val="21"/>
         </w:rPr>
-        <w:t xml:space="preserve">Prevean tiempo para preparar las herramientas antes de que comience el grupo. Acuerden organización práctica, equipo, seguridad y competencias necesarias antes de actuar. Observar no autoriza un contacto riesgoso con agua, suelo, plantas o instalaciones. Las tareas acordadas se financian o se limita abiertamente su alcance. El desarrollo ecológico y la colaboración pueden continuar más allá de una subvención sin estar financiados por ella.</w:t>
+        <w:t xml:space="preserve">Prevean tiempo para preparar las herramientas antes de que comience el grupo. Acuerden la organización práctica, el equipamiento, la seguridad y las competencias necesarias antes de actuar. Observar no autoriza un contacto riesgoso con agua, suelo, plantas o instalaciones. Las tareas acordadas se financian o se limita abiertamente su alcance. El desarrollo ecológico y la colaboración pueden continuar más allá de una subvención sin estar financiados por ella.</w:t>
       </w:r>
     </w:p>
     <w:p>
@@ -4211,7 +4211,7 @@
                 <w:b w:val="0"/>
                 <w:sz w:val="18"/>
               </w:rPr>
-              <w:t xml:space="preserve">Un grupo de intercambio de semillas o una escuela de campo</w:t>
+              <w:t xml:space="preserve">Un grupo de intercambio de semillas o una escuela campesina</w:t>
             </w:r>
           </w:p>
         </w:tc>
@@ -4395,7 +4395,7 @@
                 <w:b w:val="0"/>
                 <w:sz w:val="18"/>
               </w:rPr>
-              <w:t xml:space="preserve">Una persona especialista pertinente</w:t>
+              <w:t xml:space="preserve">Una persona especialista en el tema</w:t>
             </w:r>
           </w:p>
         </w:tc>
@@ -4728,7 +4728,7 @@
         <w:rPr>
           <w:sz w:val="21"/>
         </w:rPr>
-        <w:t xml:space="preserve">Distingan una idea, un contacto, un acuerdo, una contribución recibida y un efecto real. Revisen si el aporte es adecuado y verifiquen la seguridad, el transporte, el tiempo de trabajo, la propiedad y la responsabilidad posterior. Un posible donativo no es un recurso ya recibido. Dejen constancia de las ofertas pertinentes que se rechazaron y del trabajo que suele quedar invisible cuando sea posible dentro de los límites acordados.</w:t>
+        <w:t xml:space="preserve">Distingan una idea, un contacto, un acuerdo, una contribución recibida y un efecto real. Revisen si el aporte es adecuado y verifiquen la seguridad, el transporte, el tiempo de trabajo, la propiedad y la responsabilidad posterior. Un posible donativo no es un recurso ya recibido. Dejen constancia de las ofertas que se rechazaron y del trabajo que suele quedar invisible cuando sea posible dentro de los límites acordados.</w:t>
       </w:r>
     </w:p>
     <w:p>
@@ -4742,14 +4742,14 @@
             <w:u w:val="single"/>
             <w:sz w:val="21"/>
           </w:rPr>
-          <w:t xml:space="preserve">The Steward’s Journey</w:t>
+          <w:t xml:space="preserve">El recorrido del steward (The Steward’s Journey</w:t>
         </w:r>
       </w:hyperlink>
       <w:r>
         <w:rPr>
           <w:sz w:val="21"/>
         </w:rPr>
-        <w:t xml:space="preserve"> describe varias formas de relacionarse con el trabajo, sin una secuencia fija. Una persona cultivadora puede investigar su propio lugar, intercambiar experiencias con otras personas o establecer un acuerdo delimitado para un ensayo. El apoyo requiere un acuerdo específico; no hay que ganárselo recorriendo etapas prescritas. La enseñanza entre pares y la procuración de fondos pueden desarrollarse donde las personas lo deseen y puedan hacerlo.</w:t>
+        <w:t xml:space="preserve">) describe varias formas de relacionarse con el trabajo, sin una secuencia fija. Una persona cultivadora puede investigar su propio lugar, intercambiar experiencias con otras personas o establecer un acuerdo delimitado para un ensayo. El apoyo requiere un acuerdo específico; no hay que ganárselo recorriendo etapas prescritas. La enseñanza entre pares y la procuración de fondos pueden desarrollarse donde las personas lo deseen y puedan hacerlo.</w:t>
       </w:r>
     </w:p>
     <w:p>
@@ -5433,7 +5433,7 @@
     </w:p>
     <w:p>
       <w:r>
-        <w:t xml:space="preserve">Un apoyo opcional para conversar y retomar la experiencia. Remitan a los formatos operativos pertinentes en vez de repetir información. Distingan desconocido, no pertinente y omitido cuando se indiquen; los campos vacíos no requieren explicación.</w:t>
+        <w:t xml:space="preserve">Un apoyo opcional para conversar y retomar la experiencia. Remitan a los formatos operativos que correspondan en vez de repetir información. Distingan desconocido, no pertinente y omitido cuando se indiquen; los campos vacíos no requieren explicación.</w:t>
       </w:r>
     </w:p>
     <w:p>
@@ -5834,7 +5834,7 @@
         <w:rPr>
           <w:sz w:val="21"/>
         </w:rPr>
-        <w:t>Para los registros y los Returns, utilicen la edición acordada y versionada del formato correspondiente. Conserven sus campos, categorías y significados; las propuestas de modificación se revisan por separado. El PG Ledger apoya la documentación y el seguimiento financiero; no sustituye el sistema formal de contabilidad.</w:t>
+        <w:t>Para los registros y los regresos, utilicen la edición acordada y versionada del formato correspondiente. Conserven sus campos, categorías y significados; las propuestas de modificación se revisan por separado. El PG Ledger apoya la documentación y el seguimiento financiero; no sustituye el sistema formal de contabilidad.</w:t>
       </w:r>
     </w:p>
     <w:p>
@@ -6375,7 +6375,7 @@
         <w:rPr>
           <w:sz w:val="18"/>
         </w:rPr>
-        <w:t xml:space="preserve">El texto, las figuras y las hojas en blanco de la guía pueden copiarse, traducirse y adaptarse bajo CC BY 4.0. Atribución: Spiralweb Stewardship Association, Diario de Campo, edición en español de México v1.0, 2026. Indiquen sus cambios.</w:t>
+        <w:t xml:space="preserve">El texto, las figuras y las hojas en blanco de la guía pueden copiarse, traducirse y adaptarse bajo CC BY 4.0. Atribución: Spiralweb Stewardship Association, Diario de campo, edición en español de México v1.0.1, 2026. Indiquen sus cambios.</w:t>
       </w:r>
       <w:r>
         <w:rPr>
@@ -6402,7 +6402,7 @@
         <w:rPr>
           <w:sz w:val="18"/>
         </w:rPr>
-        <w:t xml:space="preserve">Los diarios llenados, la información personal y las grabaciones no quedan automáticamente cubiertos por la licencia abierta. Su uso compartido se acuerda por separado. Las obras externas conservan sus propias condiciones. La IA apoyó la preparación; la edición humana responsable y la corrección local siguen siendo esenciales.</w:t>
+        <w:t xml:space="preserve">Los diarios que ya contienen aportaciones, la información personal y las grabaciones no quedan automáticamente cubiertos por la licencia abierta. Su uso compartido se acuerda por separado. Las obras externas conservan sus propias condiciones. La IA apoyó la preparación; la edición humana responsable y la corrección local siguen siendo esenciales.</w:t>
       </w:r>
       <w:r>
         <w:rPr>
@@ -6482,7 +6482,7 @@
       <w:rPr>
         <w:sz w:val="16"/>
       </w:rPr>
-      <w:t xml:space="preserve">Diario de Campo     |     v1.0 · 24 de octubre de 2026     |     </w:t>
+      <w:t xml:space="preserve">Diario de campo     |     v1.0.1 · 24 de octubre de 2026     |     </w:t>
     </w:r>
     <w:fldSimple w:instr="PAGE"/>
   </w:p>

</xml_diff>

<commit_message>
Polish Field Diary language editions
Clarify consent, working wagers, omitted content and AI limits across translated editions. Preserve provisional translation notices and stable downloads.
</commit_message>
<xml_diff>
--- a/practice-guides/diario-de-campo.docx
+++ b/practice-guides/diario-de-campo.docx
@@ -41,7 +41,7 @@
         </w:drawing>
       </w:r>
       <w:r>
-        <w:t xml:space="preserve">Diario de Campo</w:t>
+        <w:t xml:space="preserve">Diario de campo</w:t>
       </w:r>
     </w:p>
     <w:p>
@@ -66,7 +66,7 @@
         <w:rPr>
           <w:sz w:val="21"/>
         </w:rPr>
-        <w:t xml:space="preserve">Edición en español de México v1.0 · 24 de octubre de 2026</w:t>
+        <w:t xml:space="preserve">Edición en español de México v1.0.1 · 24 de octubre de 2026</w:t>
       </w:r>
       <w:r>
         <w:rPr>
@@ -101,7 +101,7 @@
         <w:rPr>
           <w:sz w:val="21"/>
         </w:rPr>
-        <w:t xml:space="preserve">Diario de Campo es una guía práctica abierta, publicada por Spiralweb Stewardship Association en Spiralweb Papers. Parte del trabajo de las personas en un lugar vivo: algo se observa, se registra y se investiga en conjunto. Una acción se vuelve posible y la experiencia modifica el siguiente paso. La guía relaciona este movimiento con conocimientos pertinentes, el diálogo crítico con la IA y recursos que pueden sostener la vida del lugar y la continuidad del trabajo.</w:t>
+        <w:t xml:space="preserve">Diario de campo es una guía práctica abierta, publicada por Spiralweb Stewardship Association en Spiralweb Papers. Parte del trabajo de las personas en un lugar vivo: algo se observa, se registra y se investiga en conjunto. Una acción se vuelve posible y la experiencia modifica el siguiente paso. La guía relaciona este movimiento con conocimientos útiles para investigar, el diálogo crítico con la IA y recursos que pueden sostener la vida del lugar y la continuidad del trabajo.</w:t>
       </w:r>
     </w:p>
     <w:p>
@@ -200,7 +200,7 @@
         <w:rPr>
           <w:sz w:val="21"/>
         </w:rPr>
-        <w:t xml:space="preserve">La guía reúne una aplicación práctica de </w:t>
+        <w:t xml:space="preserve">La guía propone una aplicación práctica de </w:t>
       </w:r>
       <w:hyperlink r:id="rId15">
         <w:r>
@@ -587,7 +587,7 @@
         <w:rPr>
           <w:sz w:val="21"/>
         </w:rPr>
-        <w:t xml:space="preserve">En una reunión presentan las contribuciones que eligieron. El grupo compara las experiencias y decide investigar la cobertura del suelo. Explica su elección y guarda otras preguntas para después. La IA puede ayudar a reformular las contribuciones y sugerir explicaciones pertinentes. Las personas las revisan y corrigen los saltos injustificados de la observación a la afirmación.</w:t>
+        <w:t xml:space="preserve">En una reunión presentan las contribuciones que eligieron. El grupo compara las experiencias y decide investigar la cobertura del suelo. Explica su elección y guarda otras preguntas para después. La IA puede ayudar a reformular las contribuciones y sugerir explicaciones posibles. Las personas las revisan y corrigen los saltos injustificados de la observación a la afirmación.</w:t>
       </w:r>
     </w:p>
     <w:p>
@@ -644,7 +644,7 @@
         <w:rPr>
           <w:sz w:val="21"/>
         </w:rPr>
-        <w:t xml:space="preserve">En la siguiente visita pertinente, las nuevas observaciones se comparan con el punto de partida. La IA ha sugerido que se utilizó menos agua, pero eso no se midió. El grupo corrige el texto y examina qué puede afirmar. Quizá el transporte exigió demasiado trabajo, o la diferencia se deba a otras condiciones. Se modifican el ensayo y la distribución del trabajo.</w:t>
+        <w:t xml:space="preserve">En la siguiente visita, las nuevas observaciones se comparan con el punto de partida. La IA ha sugerido que se utilizó menos agua, pero eso no se midió. El grupo corrige el texto y examina qué puede afirmar. Quizá el transporte exigió demasiado trabajo, o la diferencia se deba a otras condiciones. Se modifican el ensayo y la distribución del trabajo.</w:t>
       </w:r>
     </w:p>
     <w:p>
@@ -663,7 +663,7 @@
         <w:rPr>
           <w:sz w:val="21"/>
         </w:rPr>
-        <w:t xml:space="preserve">Ahora el grupo puede invitar a una persona asesora o a una escuela de campo para investigar una pregunta mejor definida. Un nuevo acuerdo puede facilitar materiales, aprendizaje o remuneración para el seguimiento necesario. Al volver a la investigación, el grupo examina qué se hizo realmente posible. La comprensión compartida tiene mejores fundamentos, aunque persistan desacuerdos e incertidumbres.</w:t>
+        <w:t xml:space="preserve">Ahora el grupo puede invitar a una persona asesora o a una escuela campesina para investigar una pregunta mejor definida. Un nuevo acuerdo puede facilitar materiales, aprendizaje o remuneración para el seguimiento necesario. Al volver a la investigación, el grupo examina qué se hizo realmente posible. La comprensión compartida tiene mejores fundamentos, aunque persistan desacuerdos e incertidumbres.</w:t>
       </w:r>
     </w:p>
     <w:p>
@@ -696,7 +696,7 @@
         <w:rPr>
           <w:sz w:val="21"/>
         </w:rPr>
-        <w:t xml:space="preserve">El diario y el ledger conservan distintas partes de una misma práctica. El diario da espacio para observar e investigar. El ledger relaciona material elegido con la memoria compartida necesaria para asumir responsabilidades y dar seguimiento. La espiral de aprendizaje es el movimiento a lo largo del tiempo; no es otro documento.</w:t>
+        <w:t xml:space="preserve">El diario y el registro (ledger) conservan distintas partes de una misma práctica. El diario da espacio para observar e investigar. El registro relaciona material elegido con la memoria compartida necesaria para asumir responsabilidades y dar seguimiento. La espiral de aprendizaje es el movimiento a lo largo del tiempo; no es otro documento.</w:t>
       </w:r>
     </w:p>
     <w:tbl>
@@ -957,7 +957,7 @@
                 <w:b w:val="0"/>
                 <w:sz w:val="18"/>
               </w:rPr>
-              <w:t xml:space="preserve">Conversación, comparación y contraste con conocimientos pertinentes sobre una pregunta elegida.</w:t>
+              <w:t xml:space="preserve">Conversación, comparación y contraste con conocimientos que ayuden a esclarecer una pregunta elegida.</w:t>
             </w:r>
           </w:p>
         </w:tc>
@@ -1279,7 +1279,7 @@
         <w:pStyle w:val="Heading2"/>
       </w:pPr>
       <w:r>
-        <w:t xml:space="preserve">Cuándo un material del diario se vuelve pertinente para el ledger</w:t>
+        <w:t xml:space="preserve">Cuándo un material del diario pasa al registro</w:t>
       </w:r>
     </w:p>
     <w:p>
@@ -1298,7 +1298,7 @@
         <w:pStyle w:val="Heading2"/>
       </w:pPr>
       <w:r>
-        <w:t xml:space="preserve">Qué hace del ledger una memoria viva</w:t>
+        <w:t xml:space="preserve">Qué hace del registro una memoria viva</w:t>
       </w:r>
     </w:p>
     <w:p>
@@ -1494,14 +1494,14 @@
             <w:u w:val="single"/>
             <w:sz w:val="21"/>
           </w:rPr>
-          <w:t xml:space="preserve">working wager</w:t>
+          <w:t xml:space="preserve">apuesta de trabajo</w:t>
         </w:r>
       </w:hyperlink>
       <w:r>
         <w:rPr>
           <w:sz w:val="21"/>
         </w:rPr>
-        <w:t xml:space="preserve">, o hipótesis de trabajo, expresa lo que espera el grupo y qué podría llevarlo a cambiar su comprensión. Relaciona la pregunta con la acción, el aprendizaje, los recursos y la valoración posterior. Por ejemplo: se espera que cierta cobertura del suelo conserve la humedad si el material es adecuado y el trabajo puede sostenerse. Examinen el estado de las plantas, otras explicaciones y la carga de trabajo real.</w:t>
+        <w:t xml:space="preserve"> (working wager) expresa lo que espera el grupo y qué podría llevarlo a cambiar su comprensión. Relaciona la pregunta con la acción, el aprendizaje, los recursos y la valoración posterior. Por ejemplo: se espera que cierta cobertura del suelo conserve la humedad si el material es adecuado y el trabajo puede sostenerse. Examinen el estado de las plantas, otras explicaciones y la carga de trabajo real.</w:t>
       </w:r>
     </w:p>
     <w:p>
@@ -1542,7 +1542,7 @@
         <w:rPr>
           <w:sz w:val="21"/>
         </w:rPr>
-        <w:t xml:space="preserve">Comienza con lo que la persona observa, hace o quiere mostrar. Añade fecha, lugar y origen al material que deba poder recuperarse. Una referencia puede ser B01: primera visita, [fecha], [lugar]; las fotos y el audio pueden identificarse como B01-foto y B01-audio. El grupo elige su propio sistema y protege los lugares y las identidades sensibles.</w:t>
+        <w:t xml:space="preserve">Comiencen con lo que la persona observa, hace o quiere mostrar. Añadan fecha, lugar y origen al material que deba poder recuperarse. Una referencia puede ser B01: primera visita, [fecha], [lugar]; las fotos y el audio pueden identificarse como B01-foto y B01-audio. El grupo elige su propio sistema y protege los lugares y las identidades sensibles.</w:t>
       </w:r>
     </w:p>
     <w:p>
@@ -1632,7 +1632,7 @@
         <w:rPr>
           <w:sz w:val="21"/>
         </w:rPr>
-        <w:t xml:space="preserve">En Learning with Living Places, la observación, el trabajo de diario y la interpretación compartida acordados forman parte del tiempo remunerado de aprendizaje y trabajo. Las contribuciones adicionales son voluntarias. Otros grupos acuerdan una carga realista. La documentación debe apoyar el trabajo y simplificarse cuando lo sobrecarga.</w:t>
+        <w:t xml:space="preserve">En Learning with Living Places, la observación, el trabajo de diario y la interpretación compartida acordados forman parte del tiempo remunerado de aprendizaje y trabajo. Las contribuciones adicionales son voluntarias. Otros grupos acuerdan una carga realista. La documentación debe apoyar el trabajo y simplificarse cuando se vuelve una carga.</w:t>
       </w:r>
     </w:p>
     <w:p>
@@ -1985,7 +1985,7 @@
                 <w:b w:val="0"/>
                 <w:sz w:val="18"/>
               </w:rPr>
-              <w:t xml:space="preserve">No hay elementos suficientes para valorar la situación. Esto no significa amarillo.</w:t>
+              <w:t xml:space="preserve">No hay elementos suficientes para valorar la situación. No equivale a amarillo.</w:t>
             </w:r>
           </w:p>
         </w:tc>
@@ -2023,7 +2023,7 @@
         <w:rPr>
           <w:sz w:val="21"/>
         </w:rPr>
-        <w:t xml:space="preserve">Desconocido: la pregunta es pertinente, pero todavía no sabemos lo suficiente. No pertinente: la pregunta no corresponde a esta investigación. Omitido deliberadamente: algo no se registra o no se incluye en este material. Esto no dice nada sobre la condición de que se trate. Un campo vacío no tiene un significado único; ni las personas ni la IA pueden adivinarlo.</w:t>
+        <w:t xml:space="preserve">Desconocido: la pregunta es pertinente, pero todavía no sabemos lo suficiente. No pertinente: la pregunta no corresponde a esta investigación. Omitido deliberadamente: algo no se registra o no se incluye en este material. Esto no dice nada sobre la condición de que se trate. Un campo vacío no tiene un significado único; ni las personas ni la IA deben adivinarlo.</w:t>
       </w:r>
     </w:p>
     <w:p>
@@ -2203,7 +2203,7 @@
         <w:rPr>
           <w:sz w:val="21"/>
         </w:rPr>
-        <w:t xml:space="preserve">Acuerden a quién contactar, qué quiere preguntar el grupo, qué material puede compartirse y quién traerá la respuesta de vuelta. La asesoría, los análisis de laboratorio, el diálogo institucional o el contacto con otras personas cultivadoras se examinan junto con las experiencias originales. Una respuesta externa orienta la siguiente acción solo después de una revisión local pertinente y un acuerdo. Esto es bottom-linking en la práctica.</w:t>
+        <w:t xml:space="preserve">Acuerden a quién contactar, qué quiere preguntar el grupo, qué material puede compartirse y quién traerá la respuesta de vuelta. La asesoría, los análisis de laboratorio, el diálogo institucional o el contacto con otras personas cultivadoras se examinan junto con las experiencias originales. Una respuesta externa orienta la siguiente acción solo después de una revisión local adecuada y un acuerdo. Esto es bottom-linking (articulación desde abajo) en la práctica.</w:t>
       </w:r>
     </w:p>
     <w:p>
@@ -2244,7 +2244,7 @@
         <w:rPr>
           <w:sz w:val="21"/>
         </w:rPr>
-        <w:t xml:space="preserve">De manera individual o en grupo, las personas asumimos el papel de amigos críticos de la IA: abiertos a lo que puede aportar y atentos a errores, sobreinterpretaciones y cambios de sentido. La IA puede apoyar la expresión, la traducción, el trabajo con fuentes y la comparación. Sus contribuciones se vuelven útiles para la investigación mediante la revisión humana y su puesta a prueba en la práctica.</w:t>
+        <w:t xml:space="preserve">De manera individual o en grupo, las personas asumimos el papel de amigos críticos de la IA: con apertura a lo que puede aportar y con atención a errores, sobreinterpretaciones y cambios de sentido. La IA puede apoyar la expresión, la traducción, el trabajo con fuentes y la comparación. Sus contribuciones se vuelven útiles para la investigación mediante la revisión humana y su puesta a prueba en la práctica.</w:t>
       </w:r>
     </w:p>
     <w:p>
@@ -2305,7 +2305,7 @@
         <w:rPr>
           <w:sz w:val="21"/>
         </w:rPr>
-        <w:t xml:space="preserve">La IA recibe primero una tarea delimitada y el material elegido para ese propósito. Con una foto o una grabación, revisa lo que la IA dice que aparece en ella antes de continuar. Las palabras, imágenes y traducciones poco claras deben seguir señaladas como tales. Si el apoyo lingüístico o técnico no es suficiente, recurre a una persona competente.</w:t>
+        <w:t xml:space="preserve">La IA recibe primero una tarea claramente definida y delimitada y el material elegido para ese propósito. Con una foto o una grabación, revisa lo que la IA dice que aparece en ella antes de continuar. Las palabras, imágenes y traducciones poco claras deben seguir señaladas como tales. Si la IA no maneja bien la lengua o el tipo de material, recurre a una persona competente.</w:t>
       </w:r>
     </w:p>
     <w:p>
@@ -2335,7 +2335,7 @@
         <w:rPr>
           <w:sz w:val="21"/>
         </w:rPr>
-        <w:t xml:space="preserve">Después pregunta: ¿qué afirmaciones provienen de mi material? ¿Qué añadió la IA? ¿Qué fuentes pueden verificarse? ¿Se conservaron la incertidumbre y los desacuerdos? ¿Qué requiere otra observación o el juicio de una persona especialista? La IA también puede omitir una posibilidad pertinente; su respuesta no establece los límites de la investigación.</w:t>
+        <w:t xml:space="preserve">Después pregunta: ¿qué afirmaciones provienen de mi material? ¿Qué añadió la IA? ¿Qué fuentes pueden verificarse? ¿Se conservaron la incertidumbre y los desacuerdos? ¿Qué requiere otra observación o el juicio de una persona especialista? La IA también puede omitir una posibilidad importante; su respuesta no establece los límites de la investigación.</w:t>
       </w:r>
     </w:p>
     <w:p>
@@ -2365,7 +2365,7 @@
         <w:rPr>
           <w:sz w:val="21"/>
         </w:rPr>
-        <w:t xml:space="preserve">Por ejemplo, «El suelo se sentía más fresco» se convierte en «Se redujo el consumo de agua» en el texto de la IA. La persona señala ese salto, corrige el texto y decide qué investigación hace falta. El original, la contribución de la IA y la corrección ofrecen una base concreta para evaluar la IA en una relación adecuada con las personas y el lugar.</w:t>
+        <w:t xml:space="preserve">Por ejemplo, «El suelo se sentía más fresco» se convierte en «Se redujo el consumo de agua» en el texto de la IA. La persona señala ese salto, corrige el texto y decide qué investigación hace falta. El original, la contribución de la IA y la corrección ofrecen una base concreta para evaluar la IA en justa relación.</w:t>
       </w:r>
     </w:p>
     <w:p>
@@ -3139,7 +3139,7 @@
         <w:rPr>
           <w:sz w:val="21"/>
         </w:rPr>
-        <w:t xml:space="preserve">Las tareas acordadas forman parte del tiempo remunerado de aprendizaje y trabajo del programa. No se espera una entrega diaria del diario personal. Una actividad logra su propósito cuando abre aprendizajes y acciones pertinentes; la cantidad de documentación no es un fin en sí mismo.</w:t>
+        <w:t xml:space="preserve">En Learning with Living Places, las tareas acordadas forman parte del tiempo remunerado de aprendizaje y trabajo. No se espera una entrega diaria del diario personal. Una actividad logra su propósito cuando abre aprendizajes y acciones útiles; la cantidad de documentación no es un fin en sí mismo.</w:t>
       </w:r>
     </w:p>
     <w:p>
@@ -3199,7 +3199,7 @@
         <w:rPr>
           <w:sz w:val="21"/>
         </w:rPr>
-        <w:t xml:space="preserve">En una finca se preparan dos parcelas para distintos ensayos de cultivo. El equipo describe sus condiciones iniciales mediante observaciones propias e investigaciones especializadas pertinentes. Elige una pregunta, quizá sobre cobertura del suelo y agua, acuerda un ensayo pequeño y también documenta materiales y tiempo de trabajo. Se involucra a una escuela de campo o una persona asesora cuando eso puede ayudar a investigar. En la siguiente visita pertinente, el equipo revisa el proceso y el siguiente paso.</w:t>
+        <w:t xml:space="preserve">En un terreno de cultivo se preparan dos parcelas para distintos ensayos de cultivo. El equipo describe sus condiciones iniciales mediante observaciones propias e investigaciones especializadas sobre esas condiciones. Elige una pregunta, quizá sobre cobertura del suelo y agua, acuerda un ensayo pequeño y también documenta materiales y tiempo de trabajo. Se involucra a una escuela campesina o una persona asesora cuando eso puede ayudar a investigar. En la siguiente visita, el equipo revisa el proceso y el siguiente paso.</w:t>
       </w:r>
     </w:p>
     <w:tbl>
@@ -3368,7 +3368,7 @@
                 <w:b w:val="0"/>
                 <w:sz w:val="18"/>
               </w:rPr>
-              <w:t xml:space="preserve">Los program stewards, responsables del acompañamiento del programa, prueban el método y aclaran lenguas, acceso, funciones y seguridad.</w:t>
+              <w:t xml:space="preserve">Las personas responsables del acompañamiento (programme stewards) prueban el método y aclaran lenguas, acceso, funciones y seguridad.</w:t>
             </w:r>
           </w:p>
         </w:tc>
@@ -3644,7 +3644,7 @@
                 <w:b w:val="0"/>
                 <w:sz w:val="18"/>
               </w:rPr>
-              <w:t xml:space="preserve">El material elegido se pone en diálogo con otras personas pertinentes.</w:t>
+              <w:t xml:space="preserve">El material elegido se pone en diálogo con personas que puedan contribuir a la investigación.</w:t>
             </w:r>
           </w:p>
         </w:tc>
@@ -3736,7 +3736,7 @@
                 <w:b w:val="0"/>
                 <w:sz w:val="18"/>
               </w:rPr>
-              <w:t xml:space="preserve">Se revisan aprendizajes, equipo, recursos y responsabilidades.</w:t>
+              <w:t xml:space="preserve">Se revisan los aprendizajes, las herramientas y el equipamiento, los recursos y las responsabilidades.</w:t>
             </w:r>
           </w:p>
         </w:tc>
@@ -3793,7 +3793,7 @@
         <w:rPr>
           <w:sz w:val="21"/>
         </w:rPr>
-        <w:t xml:space="preserve">Prevean tiempo para preparar las herramientas antes de que comience el grupo. Acuerden organización práctica, equipo, seguridad y competencias necesarias antes de actuar. Observar no autoriza un contacto riesgoso con agua, suelo, plantas o instalaciones. Las tareas acordadas se financian o se limita abiertamente su alcance. El desarrollo ecológico y la colaboración pueden continuar más allá de una subvención sin estar financiados por ella.</w:t>
+        <w:t xml:space="preserve">Prevean tiempo para preparar las herramientas antes de que comience el grupo. Acuerden la organización práctica, el equipamiento, la seguridad y las competencias necesarias antes de actuar. Observar no autoriza un contacto riesgoso con agua, suelo, plantas o instalaciones. Las tareas acordadas se financian o se limita abiertamente su alcance. El desarrollo ecológico y la colaboración pueden continuar más allá de una subvención sin estar financiados por ella.</w:t>
       </w:r>
     </w:p>
     <w:p>
@@ -4211,7 +4211,7 @@
                 <w:b w:val="0"/>
                 <w:sz w:val="18"/>
               </w:rPr>
-              <w:t xml:space="preserve">Un grupo de intercambio de semillas o una escuela de campo</w:t>
+              <w:t xml:space="preserve">Un grupo de intercambio de semillas o una escuela campesina</w:t>
             </w:r>
           </w:p>
         </w:tc>
@@ -4395,7 +4395,7 @@
                 <w:b w:val="0"/>
                 <w:sz w:val="18"/>
               </w:rPr>
-              <w:t xml:space="preserve">Una persona especialista pertinente</w:t>
+              <w:t xml:space="preserve">Una persona especialista en el tema</w:t>
             </w:r>
           </w:p>
         </w:tc>
@@ -4728,7 +4728,7 @@
         <w:rPr>
           <w:sz w:val="21"/>
         </w:rPr>
-        <w:t xml:space="preserve">Distingan una idea, un contacto, un acuerdo, una contribución recibida y un efecto real. Revisen si el aporte es adecuado y verifiquen la seguridad, el transporte, el tiempo de trabajo, la propiedad y la responsabilidad posterior. Un posible donativo no es un recurso ya recibido. Dejen constancia de las ofertas pertinentes que se rechazaron y del trabajo que suele quedar invisible cuando sea posible dentro de los límites acordados.</w:t>
+        <w:t xml:space="preserve">Distingan una idea, un contacto, un acuerdo, una contribución recibida y un efecto real. Revisen si el aporte es adecuado y verifiquen la seguridad, el transporte, el tiempo de trabajo, la propiedad y la responsabilidad posterior. Un posible donativo no es un recurso ya recibido. Dejen constancia de las ofertas que se rechazaron y del trabajo que suele quedar invisible cuando sea posible dentro de los límites acordados.</w:t>
       </w:r>
     </w:p>
     <w:p>
@@ -4742,14 +4742,14 @@
             <w:u w:val="single"/>
             <w:sz w:val="21"/>
           </w:rPr>
-          <w:t xml:space="preserve">The Steward’s Journey</w:t>
+          <w:t xml:space="preserve">El recorrido del steward (The Steward’s Journey</w:t>
         </w:r>
       </w:hyperlink>
       <w:r>
         <w:rPr>
           <w:sz w:val="21"/>
         </w:rPr>
-        <w:t xml:space="preserve"> describe varias formas de relacionarse con el trabajo, sin una secuencia fija. Una persona cultivadora puede investigar su propio lugar, intercambiar experiencias con otras personas o establecer un acuerdo delimitado para un ensayo. El apoyo requiere un acuerdo específico; no hay que ganárselo recorriendo etapas prescritas. La enseñanza entre pares y la procuración de fondos pueden desarrollarse donde las personas lo deseen y puedan hacerlo.</w:t>
+        <w:t xml:space="preserve">) describe varias formas de relacionarse con el trabajo, sin una secuencia fija. Una persona cultivadora puede investigar su propio lugar, intercambiar experiencias con otras personas o establecer un acuerdo delimitado para un ensayo. El apoyo requiere un acuerdo específico; no hay que ganárselo recorriendo etapas prescritas. La enseñanza entre pares y la procuración de fondos pueden desarrollarse donde las personas lo deseen y puedan hacerlo.</w:t>
       </w:r>
     </w:p>
     <w:p>
@@ -5433,7 +5433,7 @@
     </w:p>
     <w:p>
       <w:r>
-        <w:t xml:space="preserve">Un apoyo opcional para conversar y retomar la experiencia. Remitan a los formatos operativos pertinentes en vez de repetir información. Distingan desconocido, no pertinente y omitido cuando se indiquen; los campos vacíos no requieren explicación.</w:t>
+        <w:t xml:space="preserve">Un apoyo opcional para conversar y retomar la experiencia. Remitan a los formatos operativos que correspondan en vez de repetir información. Distingan desconocido, no pertinente y omitido cuando se indiquen; los campos vacíos no requieren explicación.</w:t>
       </w:r>
     </w:p>
     <w:p>
@@ -5834,7 +5834,7 @@
         <w:rPr>
           <w:sz w:val="21"/>
         </w:rPr>
-        <w:t>Para los registros y los Returns, utilicen la edición acordada y versionada del formato correspondiente. Conserven sus campos, categorías y significados; las propuestas de modificación se revisan por separado. El PG Ledger apoya la documentación y el seguimiento financiero; no sustituye el sistema formal de contabilidad.</w:t>
+        <w:t>Para los registros y los regresos, utilicen la edición acordada y versionada del formato correspondiente. Conserven sus campos, categorías y significados; las propuestas de modificación se revisan por separado. El PG Ledger apoya la documentación y el seguimiento financiero; no sustituye el sistema formal de contabilidad.</w:t>
       </w:r>
     </w:p>
     <w:p>
@@ -6375,7 +6375,7 @@
         <w:rPr>
           <w:sz w:val="18"/>
         </w:rPr>
-        <w:t xml:space="preserve">El texto, las figuras y las hojas en blanco de la guía pueden copiarse, traducirse y adaptarse bajo CC BY 4.0. Atribución: Spiralweb Stewardship Association, Diario de Campo, edición en español de México v1.0, 2026. Indiquen sus cambios.</w:t>
+        <w:t xml:space="preserve">El texto, las figuras y las hojas en blanco de la guía pueden copiarse, traducirse y adaptarse bajo CC BY 4.0. Atribución: Spiralweb Stewardship Association, Diario de campo, edición en español de México v1.0.1, 2026. Indiquen sus cambios.</w:t>
       </w:r>
       <w:r>
         <w:rPr>
@@ -6402,7 +6402,7 @@
         <w:rPr>
           <w:sz w:val="18"/>
         </w:rPr>
-        <w:t xml:space="preserve">Los diarios llenados, la información personal y las grabaciones no quedan automáticamente cubiertos por la licencia abierta. Su uso compartido se acuerda por separado. Las obras externas conservan sus propias condiciones. La IA apoyó la preparación; la edición humana responsable y la corrección local siguen siendo esenciales.</w:t>
+        <w:t xml:space="preserve">Los diarios que ya contienen aportaciones, la información personal y las grabaciones no quedan automáticamente cubiertos por la licencia abierta. Su uso compartido se acuerda por separado. Las obras externas conservan sus propias condiciones. La IA apoyó la preparación; la edición humana responsable y la corrección local siguen siendo esenciales.</w:t>
       </w:r>
       <w:r>
         <w:rPr>
@@ -6482,7 +6482,7 @@
       <w:rPr>
         <w:sz w:val="16"/>
       </w:rPr>
-      <w:t xml:space="preserve">Diario de Campo     |     v1.0 · 24 de octubre de 2026     |     </w:t>
+      <w:t xml:space="preserve">Diario de campo     |     v1.0.1 · 24 de octubre de 2026     |     </w:t>
     </w:r>
     <w:fldSimple w:instr="PAGE"/>
   </w:p>

</xml_diff>